<commit_message>
docs: update technical doc + lessons learned for v6.1 sprint
</commit_message>
<xml_diff>
--- a/PVSP_Technical_Documentation.docx
+++ b/PVSP_Technical_Documentation.docx
@@ -128,7 +128,7 @@
                 <w:sz w:val="20"/>
                 <w:szCs w:val="20"/>
               </w:rPr>
-              <w:t xml:space="preserve">PVSP v2.0</w:t>
+              <w:t xml:space="preserve">PVSP v6.1</w:t>
             </w:r>
           </w:p>
         </w:tc>
@@ -385,7 +385,7 @@
           <w:sz w:val="20"/>
           <w:szCs w:val="20"/>
         </w:rPr>
-        <w:t xml:space="preserve">PVSP is een contract- en leveranciersmanagement applicatie gebouwd voor Nederlandse overheidsteams (Rijksoverheid context). Het biedt portfolio management, renewal tracking, risk logging, playbooks, taakbeheer en AI-gestuurde analytics.</w:t>
+        <w:t xml:space="preserve">PVSP is een contract- en leveranciersmanagement applicatie gebouwd voor Nederlandse overheidsteams (Rijksoverheid context). Het biedt portfolio management, renewal tracking, risk logging, playbooks, taakbeheer en AI-gestuurde analytics. De applicatie beheert 106 leveranciers en 144 contracten.</w:t>
       </w:r>
     </w:p>
     <w:p>
@@ -486,7 +486,7 @@
                 <w:sz w:val="20"/>
                 <w:szCs w:val="20"/>
               </w:rPr>
-              <w:t xml:space="preserve">PVSP v2.0</w:t>
+              <w:t xml:space="preserve">PVSP v6.1</w:t>
             </w:r>
           </w:p>
         </w:tc>
@@ -557,7 +557,7 @@
                 <w:sz w:val="20"/>
                 <w:szCs w:val="20"/>
               </w:rPr>
-              <w:t xml:space="preserve">Single-file HTML app (index.html, ~788 KB)</w:t>
+              <w:t xml:space="preserve">Single-file HTML app (index.html, ~1005 KB)</w:t>
             </w:r>
           </w:p>
         </w:tc>
@@ -1319,7 +1319,7 @@
                 <w:sz w:val="20"/>
                 <w:szCs w:val="20"/>
               </w:rPr>
-              <w:t xml:space="preserve">index.html (~788 KB)</w:t>
+              <w:t xml:space="preserve">index.html (~1005 KB)</w:t>
             </w:r>
           </w:p>
         </w:tc>
@@ -5469,7 +5469,7 @@
           <w:sz w:val="20"/>
           <w:szCs w:val="20"/>
         </w:rPr>
-        <w:t xml:space="preserve">PVSP slaat alle applicatiedata op in localStorage (sleutel: pvsp_v59_data). Om data te synchroniseren tussen sessies en apparaten, wordt de volledige blob periodiek gesynchroniseerd met Supabase via de backend.</w:t>
+        <w:t xml:space="preserve">PVSP slaat alle applicatiedata op in localStorage (sleutel: pvsp_v60_data). Om data te synchroniseren tussen sessies en apparaten, wordt de volledige blob periodiek gesynchroniseerd met Supabase via de backend.</w:t>
       </w:r>
     </w:p>
     <w:p>
@@ -5977,7 +5977,7 @@
           <w:sz w:val="20"/>
           <w:szCs w:val="20"/>
         </w:rPr>
-        <w:t xml:space="preserve">De localStorage blob (versie 6.0) bevat:</w:t>
+        <w:t xml:space="preserve">De localStorage blob (versie 6.1) bevat:</w:t>
       </w:r>
     </w:p>
     <w:p>
@@ -6081,7 +6081,7 @@
           <w:sz w:val="20"/>
           <w:szCs w:val="20"/>
         </w:rPr>
-        <w:t xml:space="preserve">version: "6.0" (versiebewaking voor migraties)</w:t>
+        <w:t xml:space="preserve">version: "6.1" (versiebewaking voor migraties)</w:t>
       </w:r>
     </w:p>
     <w:p>
@@ -10273,7 +10273,7 @@
                 <w:sz w:val="20"/>
                 <w:szCs w:val="20"/>
               </w:rPr>
-              <w:t xml:space="preserve">JSON string van de volledige PVSP localStorage blob (pvsp_v59_data)</w:t>
+              <w:t xml:space="preserve">JSON string van de volledige PVSP localStorage blob (pvsp_v60_data)</w:t>
             </w:r>
           </w:p>
         </w:tc>
@@ -10536,7 +10536,7 @@
                 <w:sz w:val="20"/>
                 <w:szCs w:val="20"/>
               </w:rPr>
-              <w:t xml:space="preserve">index.html (~788 KB)</w:t>
+              <w:t xml:space="preserve">index.html (~1005 KB)</w:t>
             </w:r>
           </w:p>
         </w:tc>
@@ -10678,7 +10678,7 @@
                 <w:sz w:val="20"/>
                 <w:szCs w:val="20"/>
               </w:rPr>
-              <w:t xml:space="preserve">pvsp_v59_data (localStorage, versie 6.0)</w:t>
+              <w:t xml:space="preserve">pvsp_v60_data (localStorage, versie 6.1)</w:t>
             </w:r>
           </w:p>
         </w:tc>
@@ -10749,7 +10749,7 @@
                 <w:sz w:val="20"/>
                 <w:szCs w:val="20"/>
               </w:rPr>
-              <w:t xml:space="preserve">jsPDF (PDF export), via CDN</w:t>
+              <w:t xml:space="preserve">jsPDF (PDF export), SheetJS xlsx 0.18.5 (Excel export), via CDN</w:t>
             </w:r>
           </w:p>
         </w:tc>
@@ -11858,7 +11858,7 @@
                 <w:sz w:val="20"/>
                 <w:szCs w:val="20"/>
               </w:rPr>
-              <w:t xml:space="preserve">pvsp_v59_data</w:t>
+              <w:t xml:space="preserve">pvsp_v60_data</w:t>
             </w:r>
           </w:p>
         </w:tc>
@@ -11892,7 +11892,7 @@
                 <w:sz w:val="20"/>
                 <w:szCs w:val="20"/>
               </w:rPr>
-              <w:t xml:space="preserve">Primaire applicatiedata (versie 6.0)</w:t>
+              <w:t xml:space="preserve">Primaire applicatiedata (versie 6.1)</w:t>
             </w:r>
           </w:p>
         </w:tc>
@@ -15861,6 +15861,20 @@
     </w:p>
     <w:p>
       <w:pPr>
+        <w:spacing w:after="40" w:before="40"/>
+      </w:pPr>
+      <w:r>
+        <w:rPr>
+          <w:rFonts w:ascii="Courier New" w:cs="Courier New" w:eastAsia="Courier New" w:hAnsi="Courier New"/>
+          <w:color w:val="2D2D2D"/>
+          <w:sz w:val="18"/>
+          <w:szCs w:val="18"/>
+        </w:rPr>
+        <w:t xml:space="preserve">node seed_cloud.js     # push naar Supabase cloud (productie)</w:t>
+      </w:r>
+    </w:p>
+    <w:p>
+      <w:pPr>
         <w:spacing w:after="80" w:before="60"/>
       </w:pPr>
       <w:r>
@@ -17573,7 +17587,7 @@
                 <w:sz w:val="20"/>
                 <w:szCs w:val="20"/>
               </w:rPr>
-              <w:t xml:space="preserve">index.html &gt; 788 KB. Geen nieuwe inline SVG &gt; 2 KB toevoegen.</w:t>
+              <w:t xml:space="preserve">index.html &gt; 1005 KB. Geen nieuwe inline SVG &gt; 2 KB toevoegen.</w:t>
             </w:r>
           </w:p>
         </w:tc>
@@ -17644,6 +17658,216 @@
                 <w:szCs w:val="20"/>
               </w:rPr>
               <w:t xml:space="preserve">Gebruik cat &gt; file &lt;&lt; 'EOF' patroon, nooit nano voor multi-line code.</w:t>
+            </w:r>
+          </w:p>
+        </w:tc>
+      </w:tr>
+      <w:tr>
+        <w:tc>
+          <w:tcPr>
+            <w:tcW w:type="dxa" w:w="2800"/>
+            <w:tcBorders>
+              <w:top w:val="single" w:color="CCCCCC" w:sz="1"/>
+              <w:left w:val="single" w:color="CCCCCC" w:sz="1"/>
+              <w:bottom w:val="single" w:color="CCCCCC" w:sz="1"/>
+              <w:right w:val="single" w:color="CCCCCC" w:sz="1"/>
+            </w:tcBorders>
+            <w:tcMar>
+              <w:top w:type="dxa" w:w="100"/>
+              <w:left w:type="dxa" w:w="140"/>
+              <w:bottom w:type="dxa" w:w="100"/>
+              <w:right w:type="dxa" w:w="140"/>
+            </w:tcMar>
+            <w:vAlign w:val="center"/>
+          </w:tcPr>
+          <w:p>
+            <w:pPr>
+              <w:jc w:val="left"/>
+            </w:pPr>
+            <w:r>
+              <w:rPr>
+                <w:rFonts w:ascii="Arial" w:cs="Arial" w:eastAsia="Arial" w:hAnsi="Arial"/>
+                <w:b/>
+                <w:bCs/>
+                <w:color w:val="000000"/>
+                <w:sz w:val="20"/>
+                <w:szCs w:val="20"/>
+              </w:rPr>
+              <w:t>Python patching strategie</w:t>
+            </w:r>
+          </w:p>
+        </w:tc>
+        <w:tc>
+          <w:tcPr>
+            <w:tcW w:type="dxa" w:w="6560"/>
+            <w:tcBorders>
+              <w:top w:val="single" w:color="CCCCCC" w:sz="1"/>
+              <w:left w:val="single" w:color="CCCCCC" w:sz="1"/>
+              <w:bottom w:val="single" w:color="CCCCCC" w:sz="1"/>
+              <w:right w:val="single" w:color="CCCCCC" w:sz="1"/>
+            </w:tcBorders>
+            <w:tcMar>
+              <w:top w:type="dxa" w:w="100"/>
+              <w:left w:type="dxa" w:w="140"/>
+              <w:bottom w:type="dxa" w:w="100"/>
+              <w:right w:type="dxa" w:w="140"/>
+            </w:tcMar>
+            <w:vAlign w:val="center"/>
+          </w:tcPr>
+          <w:p>
+            <w:pPr>
+              <w:jc w:val="left"/>
+            </w:pPr>
+            <w:r>
+              <w:rPr>
+                <w:rFonts w:ascii="Arial" w:cs="Arial" w:eastAsia="Arial" w:hAnsi="Arial"/>
+                <w:b w:val="false"/>
+                <w:bCs w:val="false"/>
+                <w:color w:val="000000"/>
+                <w:sz w:val="20"/>
+                <w:szCs w:val="20"/>
+              </w:rPr>
+              <w:t xml:space="preserve">Gebruik Python str.replace() voor grote multi-line JS-blokken in index.html. Het Edit-tool faalt op lange, complexe strings. Gebruik een Node.js vm-sandbox om JS-variabelen uit index.html te evalueren (voor seed_cloud.js en data-extractie).</w:t>
+            </w:r>
+          </w:p>
+        </w:tc>
+      </w:tr>
+      <w:tr>
+        <w:tc>
+          <w:tcPr>
+            <w:tcW w:type="dxa" w:w="2800"/>
+            <w:tcBorders>
+              <w:top w:val="single" w:color="CCCCCC" w:sz="1"/>
+              <w:left w:val="single" w:color="CCCCCC" w:sz="1"/>
+              <w:bottom w:val="single" w:color="CCCCCC" w:sz="1"/>
+              <w:right w:val="single" w:color="CCCCCC" w:sz="1"/>
+            </w:tcBorders>
+            <w:tcMar>
+              <w:top w:type="dxa" w:w="100"/>
+              <w:left w:type="dxa" w:w="140"/>
+              <w:bottom w:type="dxa" w:w="100"/>
+              <w:right w:type="dxa" w:w="140"/>
+            </w:tcMar>
+            <w:vAlign w:val="center"/>
+          </w:tcPr>
+          <w:p>
+            <w:pPr>
+              <w:jc w:val="left"/>
+            </w:pPr>
+            <w:r>
+              <w:rPr>
+                <w:rFonts w:ascii="Arial" w:cs="Arial" w:eastAsia="Arial" w:hAnsi="Arial"/>
+                <w:b/>
+                <w:bCs/>
+                <w:color w:val="000000"/>
+                <w:sz w:val="20"/>
+                <w:szCs w:val="20"/>
+              </w:rPr>
+              <w:t>Git lock bestanden</w:t>
+            </w:r>
+          </w:p>
+        </w:tc>
+        <w:tc>
+          <w:tcPr>
+            <w:tcW w:type="dxa" w:w="6560"/>
+            <w:tcBorders>
+              <w:top w:val="single" w:color="CCCCCC" w:sz="1"/>
+              <w:left w:val="single" w:color="CCCCCC" w:sz="1"/>
+              <w:bottom w:val="single" w:color="CCCCCC" w:sz="1"/>
+              <w:right w:val="single" w:color="CCCCCC" w:sz="1"/>
+            </w:tcBorders>
+            <w:tcMar>
+              <w:top w:type="dxa" w:w="100"/>
+              <w:left w:type="dxa" w:w="140"/>
+              <w:bottom w:type="dxa" w:w="100"/>
+              <w:right w:type="dxa" w:w="140"/>
+            </w:tcMar>
+            <w:vAlign w:val="center"/>
+          </w:tcPr>
+          <w:p>
+            <w:pPr>
+              <w:jc w:val="left"/>
+            </w:pPr>
+            <w:r>
+              <w:rPr>
+                <w:rFonts w:ascii="Arial" w:cs="Arial" w:eastAsia="Arial" w:hAnsi="Arial"/>
+                <w:b w:val="false"/>
+                <w:bCs w:val="false"/>
+                <w:color w:val="000000"/>
+                <w:sz w:val="20"/>
+                <w:szCs w:val="20"/>
+              </w:rPr>
+              <w:t xml:space="preserve">Bij git-conflicten in de sandbox: verwijder lock-bestanden met rm ~/Downloads/PVSP/.git/HEAD.lock ~/Downloads/PVSP/.git/index.lock 2&gt;/dev/null. Git push altijd handmatig uitvoeren in Terminal — de sandbox heeft geen GitHub-authenticatie.</w:t>
+            </w:r>
+          </w:p>
+        </w:tc>
+      </w:tr>
+      <w:tr>
+        <w:tc>
+          <w:tcPr>
+            <w:tcW w:type="dxa" w:w="2800"/>
+            <w:tcBorders>
+              <w:top w:val="single" w:color="CCCCCC" w:sz="1"/>
+              <w:left w:val="single" w:color="CCCCCC" w:sz="1"/>
+              <w:bottom w:val="single" w:color="CCCCCC" w:sz="1"/>
+              <w:right w:val="single" w:color="CCCCCC" w:sz="1"/>
+            </w:tcBorders>
+            <w:tcMar>
+              <w:top w:type="dxa" w:w="100"/>
+              <w:left w:type="dxa" w:w="140"/>
+              <w:bottom w:type="dxa" w:w="100"/>
+              <w:right w:type="dxa" w:w="140"/>
+            </w:tcMar>
+            <w:vAlign w:val="center"/>
+          </w:tcPr>
+          <w:p>
+            <w:pPr>
+              <w:jc w:val="left"/>
+            </w:pPr>
+            <w:r>
+              <w:rPr>
+                <w:rFonts w:ascii="Arial" w:cs="Arial" w:eastAsia="Arial" w:hAnsi="Arial"/>
+                <w:b/>
+                <w:bCs/>
+                <w:color w:val="000000"/>
+                <w:sz w:val="20"/>
+                <w:szCs w:val="20"/>
+              </w:rPr>
+              <w:t>Ontbrekende globals</w:t>
+            </w:r>
+          </w:p>
+        </w:tc>
+        <w:tc>
+          <w:tcPr>
+            <w:tcW w:type="dxa" w:w="6560"/>
+            <w:tcBorders>
+              <w:top w:val="single" w:color="CCCCCC" w:sz="1"/>
+              <w:left w:val="single" w:color="CCCCCC" w:sz="1"/>
+              <w:bottom w:val="single" w:color="CCCCCC" w:sz="1"/>
+              <w:right w:val="single" w:color="CCCCCC" w:sz="1"/>
+            </w:tcBorders>
+            <w:tcMar>
+              <w:top w:type="dxa" w:w="100"/>
+              <w:left w:type="dxa" w:w="140"/>
+              <w:bottom w:type="dxa" w:w="100"/>
+              <w:right w:type="dxa" w:w="140"/>
+            </w:tcMar>
+            <w:vAlign w:val="center"/>
+          </w:tcPr>
+          <w:p>
+            <w:pPr>
+              <w:jc w:val="left"/>
+            </w:pPr>
+            <w:r>
+              <w:rPr>
+                <w:rFonts w:ascii="Arial" w:cs="Arial" w:eastAsia="Arial" w:hAnsi="Arial"/>
+                <w:b w:val="false"/>
+                <w:bCs w:val="false"/>
+                <w:color w:val="000000"/>
+                <w:sz w:val="20"/>
+                <w:szCs w:val="20"/>
+              </w:rPr>
+              <w:t xml:space="preserve">Functies/objecten die op meerdere plaatsen worden aangeroepen maar nooit gedeclareerd zijn (bijv. RENEWAL_GATE_CONFIG, PERSONA_DISPLAY, renewalGateStatus) geven pas een runtime-fout als RENEWAL_DATA daadwerkelijk gevuld is. Controleer bij het toevoegen van nieuwe data-afhankelijke globals altijd of de declaratie al aanwezig is.</w:t>
             </w:r>
           </w:p>
         </w:tc>
@@ -17757,7 +17981,7 @@
           <w:sz w:val="20"/>
           <w:szCs w:val="20"/>
         </w:rPr>
-        <w:t xml:space="preserve">loadFromStorage() versiecheck (~regel 7757): wijst elke sessie af die niet exact overeenkomt met versie 6.0. Bij versie-bump zonder migratie verliezen alle gebruikers hun data.</w:t>
+        <w:t xml:space="preserve">loadFromStorage() versiecheck (~regel 7757): wijst elke sessie af die niet exact overeenkomt met versie 6.1. Bij versie-bump zonder migratie verliezen alle gebruikers hun data.</w:t>
       </w:r>
     </w:p>
     <w:p>
@@ -17800,6 +18024,469 @@
           <w:szCs w:val="20"/>
         </w:rPr>
         <w:t xml:space="preserve"/>
+      </w:r>
+    </w:p>
+    <w:p>
+      <w:pPr>
+        <w:pBdr>
+          <w:bottom w:val="single" w:color="DDDDDD" w:sz="4"/>
+        </w:pBdr>
+        <w:spacing w:after="200" w:before="200"/>
+      </w:pPr>
+    </w:p>
+    <w:p>
+      <w:pPr>
+        <w:pStyle w:val="Heading1"/>
+        <w:spacing w:after="240" w:before="360"/>
+      </w:pPr>
+      <w:r>
+        <w:rPr>
+          <w:rFonts w:ascii="Arial" w:cs="Arial" w:eastAsia="Arial" w:hAnsi="Arial"/>
+          <w:b/>
+          <w:sz w:val="28"/>
+        </w:rPr>
+        <w:t>13. Renewal Funnel — Technische Details</w:t>
+      </w:r>
+    </w:p>
+    <w:p>
+      <w:pPr>
+        <w:spacing w:after="80" w:before="60"/>
+      </w:pPr>
+      <w:r>
+        <w:rPr>
+          <w:rFonts w:ascii="Arial" w:cs="Arial" w:eastAsia="Arial" w:hAnsi="Arial"/>
+          <w:b/>
+          <w:sz w:val="22"/>
+        </w:rPr>
+        <w:t>Globale constanten</w:t>
+      </w:r>
+    </w:p>
+    <w:p>
+      <w:pPr>
+        <w:spacing w:after="60" w:before="40"/>
+      </w:pPr>
+      <w:r>
+        <w:rPr>
+          <w:rFonts w:ascii="Arial" w:cs="Arial" w:eastAsia="Arial" w:hAnsi="Arial"/>
+          <w:sz w:val="20"/>
+        </w:rPr>
+        <w:t xml:space="preserve">De renewal funnel vereist drie globale variabelen die vóór de RENEWAL_DATA array gedeclareerd zijn (anders ontstaan runtime errors):</w:t>
+      </w:r>
+    </w:p>
+    <w:p>
+      <w:pPr>
+        <w:spacing w:after="40" w:before="40"/>
+      </w:pPr>
+      <w:r>
+        <w:rPr>
+          <w:rFonts w:ascii="Courier New" w:cs="Courier New" w:eastAsia="Courier New" w:hAnsi="Courier New"/>
+          <w:color w:val="2D2D2D"/>
+          <w:sz w:val="18"/>
+        </w:rPr>
+        <w:t>RENEWAL_GATE_CONFIG</w:t>
+      </w:r>
+      <w:r>
+        <w:rPr>
+          <w:rFonts w:ascii="Arial" w:cs="Arial" w:eastAsia="Arial" w:hAnsi="Arial"/>
+          <w:sz w:val="20"/>
+        </w:rPr>
+        <w:t xml:space="preserve"> — definieert per trechtersstap (t9/t6/t3) de vereiste persona-handtekeningen.</w:t>
+      </w:r>
+    </w:p>
+    <w:p>
+      <w:pPr>
+        <w:spacing w:after="40" w:before="40"/>
+      </w:pPr>
+      <w:r>
+        <w:rPr>
+          <w:rFonts w:ascii="Courier New" w:cs="Courier New" w:eastAsia="Courier New" w:hAnsi="Courier New"/>
+          <w:color w:val="2D2D2D"/>
+          <w:sz w:val="18"/>
+        </w:rPr>
+        <w:t>PERSONA_DISPLAY</w:t>
+      </w:r>
+      <w:r>
+        <w:rPr>
+          <w:rFonts w:ascii="Arial" w:cs="Arial" w:eastAsia="Arial" w:hAnsi="Arial"/>
+          <w:sz w:val="20"/>
+        </w:rPr>
+        <w:t xml:space="preserve"> — mapeert persona-codes (cm, ce, po, slm, mgr) naar weergavelabels en kleuren.</w:t>
+      </w:r>
+    </w:p>
+    <w:p>
+      <w:pPr>
+        <w:spacing w:after="40" w:before="40"/>
+      </w:pPr>
+      <w:r>
+        <w:rPr>
+          <w:rFonts w:ascii="Courier New" w:cs="Courier New" w:eastAsia="Courier New" w:hAnsi="Courier New"/>
+          <w:color w:val="2D2D2D"/>
+          <w:sz w:val="18"/>
+        </w:rPr>
+        <w:t>renewalGateStatus(rd)</w:t>
+      </w:r>
+      <w:r>
+        <w:rPr>
+          <w:rFonts w:ascii="Arial" w:cs="Arial" w:eastAsia="Arial" w:hAnsi="Arial"/>
+          <w:sz w:val="20"/>
+        </w:rPr>
+        <w:t xml:space="preserve"> — berekent voor een renewal-item (rd) welke handtekeningen ontbreken (missing) en welke geblokkeerd zijn (blocking), en of de gate ontgrendeld is (unlocked).</w:t>
+      </w:r>
+    </w:p>
+    <w:p>
+      <w:pPr>
+        <w:spacing w:after="80" w:before="60"/>
+      </w:pPr>
+      <w:r>
+        <w:rPr>
+          <w:rFonts w:ascii="Arial" w:cs="Arial" w:eastAsia="Arial" w:hAnsi="Arial"/>
+          <w:b/>
+          <w:sz w:val="22"/>
+        </w:rPr>
+        <w:t>RENEWAL_DATA en seed_cloud.js</w:t>
+      </w:r>
+    </w:p>
+    <w:p>
+      <w:pPr>
+        <w:spacing w:after="60" w:before="40"/>
+      </w:pPr>
+      <w:r>
+        <w:rPr>
+          <w:rFonts w:ascii="Arial" w:cs="Arial" w:eastAsia="Arial" w:hAnsi="Arial"/>
+          <w:sz w:val="20"/>
+        </w:rPr>
+        <w:t xml:space="preserve">RENEWAL_DATA is een globale array met 15 realistische entries verdeeld over de stadia T-3, T-6, T-9 en T-12 (relatief aan de huidige datum). Elk item bevat een vendorId, contractId, renewalDatum, stage en een signoffs-array met per persona een vote (approve / object) en timestamp.</w:t>
+      </w:r>
+    </w:p>
+    <w:p>
+      <w:pPr>
+        <w:spacing w:after="60" w:before="40"/>
+      </w:pPr>
+      <w:r>
+        <w:rPr>
+          <w:rFonts w:ascii="Arial" w:cs="Arial" w:eastAsia="Arial" w:hAnsi="Arial"/>
+          <w:sz w:val="20"/>
+        </w:rPr>
+        <w:t xml:space="preserve">seed_cloud.js (pvsp-backend/) extraheert alle data-variabelen dynamisch uit index.html via een Node.js vm-sandbox en synchroniseert het resultaat naar Supabase. RENEWAL_DATA is opgenomen in de snapshot naast VENDORS, TASKS, RISKS, etc.</w:t>
+      </w:r>
+    </w:p>
+    <w:p>
+      <w:pPr>
+        <w:pStyle w:val="Heading1"/>
+        <w:spacing w:after="240" w:before="360"/>
+      </w:pPr>
+      <w:r>
+        <w:rPr>
+          <w:rFonts w:ascii="Arial" w:cs="Arial" w:eastAsia="Arial" w:hAnsi="Arial"/>
+          <w:b/>
+          <w:sz w:val="28"/>
+        </w:rPr>
+        <w:t>14. Compliance Checklist Velden</w:t>
+      </w:r>
+    </w:p>
+    <w:p>
+      <w:pPr>
+        <w:spacing w:after="60" w:before="40"/>
+      </w:pPr>
+      <w:r>
+        <w:rPr>
+          <w:rFonts w:ascii="Arial" w:cs="Arial" w:eastAsia="Arial" w:hAnsi="Arial"/>
+          <w:sz w:val="20"/>
+        </w:rPr>
+        <w:t xml:space="preserve">Elk contract bevat zes compliance-velden. Toegestane waarden: “Ja”, “Nee”, “Nvt”, “In onderhandeling” of null. Alerts worden alleen gegenereerd bij de expliciete waarde “Nee”.</w:t>
+      </w:r>
+    </w:p>
+    <w:p>
+      <w:pPr>
+        <w:spacing w:after="40" w:before="40"/>
+      </w:pPr>
+      <w:r>
+        <w:rPr>
+          <w:rFonts w:ascii="Courier New" w:cs="Courier New" w:eastAsia="Courier New" w:hAnsi="Courier New"/>
+          <w:color w:val="2D2D2D"/>
+          <w:sz w:val="18"/>
+        </w:rPr>
+        <w:t>governance_ok</w:t>
+      </w:r>
+      <w:r>
+        <w:rPr>
+          <w:rFonts w:ascii="Arial" w:cs="Arial" w:eastAsia="Arial" w:hAnsi="Arial"/>
+          <w:sz w:val="20"/>
+        </w:rPr>
+        <w:t xml:space="preserve"> — Governance is ingericht voor dit contract.</w:t>
+      </w:r>
+    </w:p>
+    <w:p>
+      <w:pPr>
+        <w:spacing w:after="40" w:before="40"/>
+      </w:pPr>
+      <w:r>
+        <w:rPr>
+          <w:rFonts w:ascii="Courier New" w:cs="Courier New" w:eastAsia="Courier New" w:hAnsi="Courier New"/>
+          <w:color w:val="2D2D2D"/>
+          <w:sz w:val="18"/>
+        </w:rPr>
+        <w:t>vwo</w:t>
+      </w:r>
+      <w:r>
+        <w:rPr>
+          <w:rFonts w:ascii="Arial" w:cs="Arial" w:eastAsia="Arial" w:hAnsi="Arial"/>
+          <w:sz w:val="20"/>
+        </w:rPr>
+        <w:t xml:space="preserve"> — Verwerkersovereenkomst aanwezig en actueel.</w:t>
+      </w:r>
+    </w:p>
+    <w:p>
+      <w:pPr>
+        <w:spacing w:after="40" w:before="40"/>
+      </w:pPr>
+      <w:r>
+        <w:rPr>
+          <w:rFonts w:ascii="Courier New" w:cs="Courier New" w:eastAsia="Courier New" w:hAnsi="Courier New"/>
+          <w:color w:val="2D2D2D"/>
+          <w:sz w:val="18"/>
+        </w:rPr>
+        <w:t>sla</w:t>
+      </w:r>
+      <w:r>
+        <w:rPr>
+          <w:rFonts w:ascii="Arial" w:cs="Arial" w:eastAsia="Arial" w:hAnsi="Arial"/>
+          <w:sz w:val="20"/>
+        </w:rPr>
+        <w:t xml:space="preserve"> — SLA is vastgelegd en ondertekend.</w:t>
+      </w:r>
+    </w:p>
+    <w:p>
+      <w:pPr>
+        <w:spacing w:after="40" w:before="40"/>
+      </w:pPr>
+      <w:r>
+        <w:rPr>
+          <w:rFonts w:ascii="Courier New" w:cs="Courier New" w:eastAsia="Courier New" w:hAnsi="Courier New"/>
+          <w:color w:val="2D2D2D"/>
+          <w:sz w:val="18"/>
+        </w:rPr>
+        <w:t>dap</w:t>
+      </w:r>
+      <w:r>
+        <w:rPr>
+          <w:rFonts w:ascii="Arial" w:cs="Arial" w:eastAsia="Arial" w:hAnsi="Arial"/>
+          <w:sz w:val="20"/>
+        </w:rPr>
+        <w:t xml:space="preserve"> — Data Afgifte Protocol vastgesteld.</w:t>
+      </w:r>
+    </w:p>
+    <w:p>
+      <w:pPr>
+        <w:spacing w:after="40" w:before="40"/>
+      </w:pPr>
+      <w:r>
+        <w:rPr>
+          <w:rFonts w:ascii="Courier New" w:cs="Courier New" w:eastAsia="Courier New" w:hAnsi="Courier New"/>
+          <w:color w:val="2D2D2D"/>
+          <w:sz w:val="18"/>
+        </w:rPr>
+        <w:t>contract_present</w:t>
+      </w:r>
+      <w:r>
+        <w:rPr>
+          <w:rFonts w:ascii="Arial" w:cs="Arial" w:eastAsia="Arial" w:hAnsi="Arial"/>
+          <w:sz w:val="20"/>
+        </w:rPr>
+        <w:t xml:space="preserve"> — Contractdocument aanwezig in het dossier.</w:t>
+      </w:r>
+    </w:p>
+    <w:p>
+      <w:pPr>
+        <w:spacing w:after="40" w:before="40"/>
+      </w:pPr>
+      <w:r>
+        <w:rPr>
+          <w:rFonts w:ascii="Courier New" w:cs="Courier New" w:eastAsia="Courier New" w:hAnsi="Courier New"/>
+          <w:color w:val="2D2D2D"/>
+          <w:sz w:val="18"/>
+        </w:rPr>
+        <w:t>via_broker</w:t>
+      </w:r>
+      <w:r>
+        <w:rPr>
+          <w:rFonts w:ascii="Arial" w:cs="Arial" w:eastAsia="Arial" w:hAnsi="Arial"/>
+          <w:sz w:val="20"/>
+        </w:rPr>
+        <w:t xml:space="preserve"> — Contract loopt via een broker/intermediair.</w:t>
+      </w:r>
+    </w:p>
+    <w:p>
+      <w:pPr>
+        <w:spacing w:after="40" w:before="40"/>
+      </w:pPr>
+      <w:r>
+        <w:rPr>
+          <w:rFonts w:ascii="Courier New" w:cs="Courier New" w:eastAsia="Courier New" w:hAnsi="Courier New"/>
+          <w:color w:val="2D2D2D"/>
+          <w:sz w:val="18"/>
+        </w:rPr>
+        <w:t>mdt_team</w:t>
+      </w:r>
+      <w:r>
+        <w:rPr>
+          <w:rFonts w:ascii="Arial" w:cs="Arial" w:eastAsia="Arial" w:hAnsi="Arial"/>
+          <w:sz w:val="20"/>
+        </w:rPr>
+        <w:t xml:space="preserve"> — Verantwoordelijk MDT-team (bijv. “MDT Sociaal”).</w:t>
+      </w:r>
+    </w:p>
+    <w:p>
+      <w:pPr>
+        <w:spacing w:after="80" w:before="60"/>
+      </w:pPr>
+      <w:r>
+        <w:rPr>
+          <w:rFonts w:ascii="Arial" w:cs="Arial" w:eastAsia="Arial" w:hAnsi="Arial"/>
+          <w:b/>
+          <w:sz w:val="22"/>
+        </w:rPr>
+        <w:t>Compliance alerts</w:t>
+      </w:r>
+    </w:p>
+    <w:p>
+      <w:pPr>
+        <w:spacing w:after="60" w:before="40"/>
+      </w:pPr>
+      <w:r>
+        <w:rPr>
+          <w:rFonts w:ascii="Arial" w:cs="Arial" w:eastAsia="Arial" w:hAnsi="Arial"/>
+          <w:sz w:val="20"/>
+        </w:rPr>
+        <w:t xml:space="preserve">_renderAlertList() genereert automatisch alerts voor actieve contracten waarbij governance_ok, vwo, dap of contract_present de waarde “Nee” hebben. Alerts worden geplaatst in de “attention” groep (paars/teal/amber kleurcodering per veld). Maximum 20 compliance-alerts per render om de alert-panel niet te overspoelen.</w:t>
+      </w:r>
+    </w:p>
+    <w:p>
+      <w:pPr>
+        <w:pStyle w:val="Heading1"/>
+        <w:spacing w:after="240" w:before="360"/>
+      </w:pPr>
+      <w:r>
+        <w:rPr>
+          <w:rFonts w:ascii="Arial" w:cs="Arial" w:eastAsia="Arial" w:hAnsi="Arial"/>
+          <w:b/>
+          <w:sz w:val="28"/>
+        </w:rPr>
+        <w:t>15. Excel Export (SheetJS)</w:t>
+      </w:r>
+    </w:p>
+    <w:p>
+      <w:pPr>
+        <w:spacing w:after="60" w:before="40"/>
+      </w:pPr>
+      <w:r>
+        <w:rPr>
+          <w:rFonts w:ascii="Arial" w:cs="Arial" w:eastAsia="Arial" w:hAnsi="Arial"/>
+          <w:sz w:val="20"/>
+        </w:rPr>
+        <w:t xml:space="preserve">Beide export-functies gebruiken SheetJS (xlsx 0.18.5) geladen via CDN. De bibliotheek wordt bij pagina-load asynchroon geladen — de functies controleren of XLSX beschikbaar is voor gebruik.</w:t>
+      </w:r>
+    </w:p>
+    <w:p>
+      <w:pPr>
+        <w:spacing w:after="40" w:before="40"/>
+      </w:pPr>
+      <w:r>
+        <w:rPr>
+          <w:rFonts w:ascii="Courier New" w:cs="Courier New" w:eastAsia="Courier New" w:hAnsi="Courier New"/>
+          <w:color w:val="2D2D2D"/>
+          <w:sz w:val="18"/>
+        </w:rPr>
+        <w:t>exportVendorsXLSX()</w:t>
+      </w:r>
+      <w:r>
+        <w:rPr>
+          <w:rFonts w:ascii="Arial" w:cs="Arial" w:eastAsia="Arial" w:hAnsi="Arial"/>
+          <w:sz w:val="20"/>
+        </w:rPr>
+        <w:t xml:space="preserve"> — knop op de Vendors-pagina. Exporteert alle 106 leveranciers met VHS-subscores, Kraljic, lifecycle, risico, portfoliowaarde en contractaantal. Bestand: PVSP-Vendors-[datum].xlsx.</w:t>
+      </w:r>
+    </w:p>
+    <w:p>
+      <w:pPr>
+        <w:spacing w:after="40" w:before="40"/>
+      </w:pPr>
+      <w:r>
+        <w:rPr>
+          <w:rFonts w:ascii="Courier New" w:cs="Courier New" w:eastAsia="Courier New" w:hAnsi="Courier New"/>
+          <w:color w:val="2D2D2D"/>
+          <w:sz w:val="18"/>
+        </w:rPr>
+        <w:t>exportContractsXLSX()</w:t>
+      </w:r>
+      <w:r>
+        <w:rPr>
+          <w:rFonts w:ascii="Arial" w:cs="Arial" w:eastAsia="Arial" w:hAnsi="Arial"/>
+          <w:sz w:val="20"/>
+        </w:rPr>
+        <w:t xml:space="preserve"> — knop in de modus-balk op de Contracts-pagina. Exporteert alle 144 contracten inclusief alle compliance-velden, looptijden en waarden. Bestand: PVSP-Contracts-[datum].xlsx.</w:t>
+      </w:r>
+    </w:p>
+    <w:p>
+      <w:pPr>
+        <w:pStyle w:val="Heading1"/>
+        <w:spacing w:after="240" w:before="360"/>
+      </w:pPr>
+      <w:r>
+        <w:rPr>
+          <w:rFonts w:ascii="Arial" w:cs="Arial" w:eastAsia="Arial" w:hAnsi="Arial"/>
+          <w:b/>
+          <w:sz w:val="28"/>
+        </w:rPr>
+        <w:t>16. SLM Dashboard — Data-driven MTTR/Uptime</w:t>
+      </w:r>
+    </w:p>
+    <w:p>
+      <w:pPr>
+        <w:spacing w:after="60" w:before="40"/>
+      </w:pPr>
+      <w:r>
+        <w:rPr>
+          <w:rFonts w:ascii="Arial" w:cs="Arial" w:eastAsia="Arial" w:hAnsi="Arial"/>
+          <w:sz w:val="20"/>
+        </w:rPr>
+        <w:t xml:space="preserve">Het SLM-dashboard (Service Level Management) berekent MTTR en uptime nu data-driven op basis van de performance-subscore (v.h.p) van elke leverancier. De vorige implementatie bevatte hardgecodeerde waarden voor zes specifieke vendor-ID’s (1–6) die niet klopten voor de overige 100 vendors.</w:t>
+      </w:r>
+    </w:p>
+    <w:p>
+      <w:pPr>
+        <w:spacing w:after="40" w:before="40"/>
+      </w:pPr>
+      <w:r>
+        <w:rPr>
+          <w:rFonts w:ascii="Arial" w:cs="Arial" w:eastAsia="Arial" w:hAnsi="Arial"/>
+          <w:sz w:val="20"/>
+        </w:rPr>
+        <w:t xml:space="preserve">MTTR: p≥90 → 8h | p≥80 → 12h | p≥70 → 24h | p≥60 → 48h | anders → 72h</w:t>
+      </w:r>
+    </w:p>
+    <w:p>
+      <w:pPr>
+        <w:spacing w:after="40" w:before="40"/>
+      </w:pPr>
+      <w:r>
+        <w:rPr>
+          <w:rFonts w:ascii="Arial" w:cs="Arial" w:eastAsia="Arial" w:hAnsi="Arial"/>
+          <w:sz w:val="20"/>
+        </w:rPr>
+        <w:t xml:space="preserve">Uptime: p≥90 → 99.95% | p≥80 → 99.7% | p≥70 → 99.3% | p≥60 → 98.5% | anders → 97.8%</w:t>
+      </w:r>
+    </w:p>
+    <w:p>
+      <w:pPr>
+        <w:spacing w:after="60" w:before="40"/>
+      </w:pPr>
+      <w:r>
+        <w:rPr>
+          <w:rFonts w:ascii="Arial" w:cs="Arial" w:eastAsia="Arial" w:hAnsi="Arial"/>
+          <w:sz w:val="20"/>
+        </w:rPr>
+        <w:t xml:space="preserve">SLA-target: strategic → 99.9% | routine → 99.0% | overig → 99.5% (gebaseerd op v.kraljic_category).</w:t>
       </w:r>
     </w:p>
     <w:p>

</xml_diff>